<commit_message>
Remove tests and redundant project code
</commit_message>
<xml_diff>
--- a/docs/Ryan_Final_Project_Report.docx
+++ b/docs/Ryan_Final_Project_Report.docx
@@ -160,7 +160,7 @@
         <w:rPr>
           <w:i w:val="0"/>
         </w:rPr>
-        <w:t>Fuel-price changes directly affect Nairobi transport operators and small businesses. This project designed and implemented MafutaPlan, a component-based system that separates machine-learning prediction from deterministic price reconstruction, scenario analysis, and fuel-cost calculation. A pooled multiple linear regression model uses landed cost, distribution and storage, margins, stabilization adjustment, taxes and levies, and encoded fuel type to estimate the following cycle's retail price. The reviewed data contains 33 fuel-cycle records across 11 official EPRA component cycles. Chronological evaluation trains on 30 records with targets from September 2024 to March 2026 and tests on three April 2026 records. The test MAE is 15.41 KSh/L and RMSE is 19.30 KSh/L. The intended final design is June 2026 components to July 2026 prices; however, verified June components are not available in the repository. July predictions are therefore not published, preventing target leakage and fabricated accuracy. The Streamlit system still provides source-linked reconstruction, factor explanation, scenarios, and budget and journey calculators.</w:t>
+        <w:t>Fuel-price changes directly affect Nairobi transport operators and small businesses. This project designed and implemented MafutaPlan, a component-based system that separates machine-learning prediction from deterministic price reconstruction, scenario analysis, and fuel-cost calculation. A pooled multiple linear regression model uses landed cost, distribution and storage, margins, stabilization adjustment, taxes and levies, and encoded fuel type to estimate the following cycle's retail price. The reviewed data contains 33 fuel-cycle records across 11 official EPRA component cycles. Chronological evaluation trains on 30 records with targets from September 2024 to March 2026 and is evaluated on three April 2026 records. The holdout MAE is 15.41 KSh/L and RMSE is 19.30 KSh/L. The intended final design is June 2026 components to July 2026 prices; however, verified June components are not available in the repository. July predictions are therefore not published, preventing target leakage and fabricated accuracy. The Streamlit system still provides source-linked reconstruction, factor explanation, scenarios, and budget and journey calculators.</w:t>
       </w:r>
     </w:p>
     <w:p>
@@ -195,7 +195,7 @@
         <w:br/>
         <w:t>Chapter Three: Methodology and System Design</w:t>
         <w:br/>
-        <w:t>Chapter Four: Implementation, Results and Testing</w:t>
+        <w:t>Chapter Four: Implementation, Results and Verification</w:t>
         <w:br/>
         <w:t>Chapter Five: Summary, Conclusions and Recommendations</w:t>
         <w:br/>
@@ -2309,7 +2309,7 @@
         <w:pStyle w:val="Heading1"/>
       </w:pPr>
       <w:r>
-        <w:t>CHAPTER FOUR: IMPLEMENTATION, RESULTS AND TESTING</w:t>
+        <w:t>CHAPTER FOUR: IMPLEMENTATION, RESULTS AND VERIFICATION</w:t>
       </w:r>
     </w:p>
     <w:p>
@@ -3606,38 +3606,6 @@
           <w:i w:val="0"/>
         </w:rPr>
         <w:t>Verified June 2026 component inputs are absent. July predictions, absolute errors, percentage errors, MAE, and RMSE are therefore not claimed. July official values are retained only as final evaluation values. Using July components would be target leakage; substituting March components would change the one-cycle-ahead horizon without evidence.</w:t>
-      </w:r>
-    </w:p>
-    <w:p>
-      <w:pPr>
-        <w:pStyle w:val="Heading2"/>
-      </w:pPr>
-      <w:r>
-        <w:t>4.6 Automated Testing</w:t>
-      </w:r>
-    </w:p>
-    <w:p>
-      <w:r>
-        <w:rPr>
-          <w:i w:val="0"/>
-        </w:rPr>
-        <w:t>Twenty-six unittest cases verify required files, schemas, missing values, duplicates, date logic, source IDs, HTTPS links, fuel types, arithmetic, reconstruction accuracy, input-target ordering, July exclusion, linear regression, finite coefficients and predictions, all-fuel result generation, MAE, RMSE, calculator validation, scenario logic, official values, and Streamlit data loading.</w:t>
-      </w:r>
-    </w:p>
-    <w:p>
-      <w:pPr>
-        <w:pStyle w:val="Heading2"/>
-      </w:pPr>
-      <w:r>
-        <w:t>4.7 Interface Verification</w:t>
-      </w:r>
-    </w:p>
-    <w:p>
-      <w:r>
-        <w:rPr>
-          <w:i w:val="0"/>
-        </w:rPr>
-        <w:t>Final interface screenshots are generated during the manual Streamlit verification pass and stored in outputs/screenshots.</w:t>
       </w:r>
     </w:p>
     <w:p>
@@ -6555,7 +6523,7 @@
         <w:pStyle w:val="Heading2"/>
       </w:pPr>
       <w:r>
-        <w:t>Appendix D: Test and Reproduction Commands</w:t>
+        <w:t>Appendix D: Reproduction Commands</w:t>
       </w:r>
     </w:p>
     <w:p>
@@ -6587,15 +6555,7 @@
         <w:pStyle w:val="ListBullet"/>
       </w:pPr>
       <w:r>
-        <w:t>python -m unittest discover -s tests -v</w:t>
-      </w:r>
-    </w:p>
-    <w:p>
-      <w:pPr>
-        <w:pStyle w:val="ListBullet"/>
-      </w:pPr>
-      <w:r>
-        <w:t>python -m compileall app.py src scripts tests</w:t>
+        <w:t>python -m compileall app.py src scripts</w:t>
       </w:r>
     </w:p>
     <w:p>

</xml_diff>

<commit_message>
Use latest complete cycle for April forecast
</commit_message>
<xml_diff>
--- a/docs/Ryan_Final_Project_Report.docx
+++ b/docs/Ryan_Final_Project_Report.docx
@@ -160,7 +160,7 @@
         <w:rPr>
           <w:i w:val="0"/>
         </w:rPr>
-        <w:t>Fuel-price changes directly affect Nairobi transport operators and small businesses. This project designed and implemented MafutaPlan, a component-based system that separates machine-learning prediction from deterministic price reconstruction, scenario analysis, and fuel-cost calculation. A pooled multiple linear regression model uses landed cost, distribution and storage, margins, stabilization adjustment, taxes and levies, and encoded fuel type to estimate the following cycle's retail price. The reviewed data contains 33 fuel-cycle records across 11 official EPRA component cycles. Chronological evaluation trains on 30 records with targets from September 2024 to March 2026 and is evaluated on three April 2026 records. The holdout MAE is 15.41 KSh/L and RMSE is 19.30 KSh/L. The intended final design is June 2026 components to July 2026 prices; however, verified June components are not available in the repository. July predictions are therefore not published, preventing target leakage and fabricated accuracy. The Streamlit system still provides source-linked reconstruction, factor explanation, scenarios, and budget and journey calculators.</w:t>
+        <w:t>Fuel-price changes directly affect Nairobi transport operators and small businesses. This project designed and implemented MafutaPlan, a component-based system that separates machine-learning prediction from deterministic price reconstruction, scenario analysis, and fuel-cost calculation. A pooled multiple linear regression model uses landed cost, distribution and storage, margins, stabilization adjustment, taxes and levies, and encoded fuel type to estimate the following cycle's retail price. The reviewed data contains 33 fuel-cycle records across 11 official EPRA component cycles. Chronological evaluation trains on 30 records with targets from September 2024 to March 2026 and is evaluated on three April 2026 records. The holdout MAE is 15.41 KSh/L and RMSE is 19.30 KSh/L. The latest complete component cycle is March 2026, which is used to predict the immediately following April 2026 retail-price cycle. The Streamlit system also provides live EPRA retail-price display, source-linked reconstruction, factor explanation, scenarios, and budget and journey calculators.</w:t>
       </w:r>
     </w:p>
     <w:p>
@@ -697,7 +697,7 @@
         <w:rPr>
           <w:i w:val="0"/>
         </w:rPr>
-        <w:t>To design and implement a component-based machine-learning system using multiple linear regression to predict July 2026 maximum retail fuel prices in Nairobi and support fuel-budget planning.</w:t>
+        <w:t>To design and implement a component-based machine-learning system using multiple linear regression to predict the next-cycle maximum retail fuel prices in Nairobi and support fuel-budget planning.</w:t>
       </w:r>
     </w:p>
     <w:p>
@@ -737,7 +737,7 @@
         <w:pStyle w:val="ListNumber"/>
       </w:pPr>
       <w:r>
-        <w:t>To predict July 2026 prices for Super Petrol, Diesel and Kerosene.</w:t>
+        <w:t>To predict April 2026 prices from March 2026 components for Super Petrol, Diesel and Kerosene.</w:t>
       </w:r>
     </w:p>
     <w:p>
@@ -745,7 +745,7 @@
         <w:pStyle w:val="ListNumber"/>
       </w:pPr>
       <w:r>
-        <w:t>To compare predicted July prices with official July prices.</w:t>
+        <w:t>To compare predicted April prices with official April prices.</w:t>
       </w:r>
     </w:p>
     <w:p>
@@ -785,7 +785,7 @@
         <w:pStyle w:val="ListNumber"/>
       </w:pPr>
       <w:r>
-        <w:t>How accurately can multiple linear regression predict July 2026 fuel prices?</w:t>
+        <w:t>How accurately can multiple linear regression predict the held-out April 2026 fuel prices?</w:t>
       </w:r>
     </w:p>
     <w:p>
@@ -817,7 +817,7 @@
         <w:rPr>
           <w:i w:val="0"/>
         </w:rPr>
-        <w:t>The primary persona is Brian, a Nairobi ride-hailing driver. Brian views the July prediction status, examines price factors, estimates weekly fuel expenses, calculates journey costs, and plans his transport budget.</w:t>
+        <w:t>The primary persona is Brian, a Nairobi ride-hailing driver. Brian views the April prediction, examines price factors, estimates weekly fuel expenses, calculates journey costs, and plans his transport budget.</w:t>
       </w:r>
     </w:p>
     <w:p>
@@ -849,7 +849,7 @@
         <w:pStyle w:val="ListBullet"/>
       </w:pPr>
       <w:r>
-        <w:t>July components cannot be used to predict July without leakage.</w:t>
+        <w:t>Each prediction must use components from the immediately preceding cycle.</w:t>
       </w:r>
     </w:p>
     <w:p>
@@ -1225,7 +1225,7 @@
         <w:rPr>
           <w:i w:val="0"/>
         </w:rPr>
-        <w:t>Random train-test splitting can allow later regulatory regimes to influence earlier predictions. MafutaPlan orders records chronologically and reserves the latest complete target cycle. July 2026 is never included in training. MAE reports the average absolute error and RMSE gives greater weight to larger errors.</w:t>
+        <w:t>Random train-test splitting can allow later regulatory regimes to influence earlier predictions. MafutaPlan orders records chronologically and reserves the latest complete target cycle, April 2026, for holdout evaluation. MAE reports the average absolute error and RMSE gives greater weight to larger errors.</w:t>
       </w:r>
     </w:p>
     <w:p>
@@ -1765,7 +1765,7 @@
         <w:rPr>
           <w:i w:val="0"/>
         </w:rPr>
-        <w:t>Training targets run from September 2024 to March 2026 using 30 rows. The chronological test target is April 2026 with 3 rows. July 2026 is outside training and is reserved for final evaluation only when verified June component inputs exist.</w:t>
+        <w:t>Training targets run from September 2024 to March 2026 using 30 rows. The chronological test target is April 2026 with 3 rows. Its inputs are the latest complete component records from March 2026.</w:t>
       </w:r>
     </w:p>
     <w:p>
@@ -2203,7 +2203,7 @@
         <w:drawing>
           <wp:inline xmlns:a="http://schemas.openxmlformats.org/drawingml/2006/main" xmlns:pic="http://schemas.openxmlformats.org/drawingml/2006/picture">
             <wp:extent cx="5577840" cy="1451124"/>
-            <wp:docPr id="3" name="Picture 3" descr="Figure 3.2: MafutaPlan system architecture and July availability gate"/>
+            <wp:docPr id="3" name="Picture 3" descr="Figure 3.2: MafutaPlan system architecture and March-to-April forecast"/>
             <wp:cNvGraphicFramePr>
               <a:graphicFrameLocks noChangeAspect="1"/>
             </wp:cNvGraphicFramePr>
@@ -2240,7 +2240,7 @@
         <w:jc w:val="center"/>
       </w:pPr>
       <w:r>
-        <w:t>Figure 3.2: MafutaPlan system architecture and July availability gate</w:t>
+        <w:t>Figure 3.2: MafutaPlan system architecture and March-to-April forecast</w:t>
       </w:r>
     </w:p>
     <w:p>
@@ -2325,7 +2325,7 @@
         <w:rPr>
           <w:i w:val="0"/>
         </w:rPr>
-        <w:t>The implementation uses Python, pandas, scikit-learn, and Streamlit. The application has six pages: Home, July 2026 Prediction, Factors Affecting Fuel Price, Price Reconstruction, Fuel Calculator, and Data and Methodology. The model code directly creates the design matrix, fits one LinearRegression estimator, and reports coefficients and chronological errors without model-selection abstraction.</w:t>
+        <w:t>The implementation uses Python, pandas, scikit-learn, and Streamlit. The application has six pages: Home, Fuel Price Prediction, Factors Affecting Fuel Price, Price Reconstruction, Fuel Calculator, and Data and Methodology. The model code directly creates the design matrix, fits one LinearRegression estimator, and reports coefficients and chronological errors without model-selection abstraction.</w:t>
       </w:r>
     </w:p>
     <w:p>
@@ -3268,7 +3268,7 @@
         <w:pStyle w:val="Heading2"/>
       </w:pPr>
       <w:r>
-        <w:t>4.5 July 2026 Final Evaluation Status</w:t>
+        <w:t>4.5 April 2026 Prediction Results</w:t>
       </w:r>
     </w:p>
     <w:tbl>
@@ -3316,7 +3316,7 @@
                 <w:b/>
                 <w:sz w:val="18"/>
               </w:rPr>
-              <w:t>Official July price</w:t>
+              <w:t>Official April price</w:t>
             </w:r>
           </w:p>
         </w:tc>
@@ -3348,7 +3348,171 @@
                 <w:b/>
                 <w:sz w:val="18"/>
               </w:rPr>
-              <w:t>Error</w:t>
+              <w:t>Absolute error</w:t>
+            </w:r>
+          </w:p>
+        </w:tc>
+      </w:tr>
+      <w:tr>
+        <w:tc>
+          <w:tcPr>
+            <w:tcW w:type="dxa" w:w="2448"/>
+            <w:vAlign w:val="center"/>
+            <w:tcMar>
+              <w:top w:w="80" w:type="dxa"/>
+              <w:start w:w="120" w:type="dxa"/>
+              <w:bottom w:w="80" w:type="dxa"/>
+              <w:end w:w="120" w:type="dxa"/>
+            </w:tcMar>
+          </w:tcPr>
+          <w:p>
+            <w:r>
+              <w:rPr>
+                <w:sz w:val="18"/>
+              </w:rPr>
+              <w:t>Diesel</w:t>
+            </w:r>
+          </w:p>
+        </w:tc>
+        <w:tc>
+          <w:tcPr>
+            <w:tcW w:type="dxa" w:w="2304"/>
+            <w:vAlign w:val="center"/>
+            <w:tcMar>
+              <w:top w:w="80" w:type="dxa"/>
+              <w:start w:w="120" w:type="dxa"/>
+              <w:bottom w:w="80" w:type="dxa"/>
+              <w:end w:w="120" w:type="dxa"/>
+            </w:tcMar>
+          </w:tcPr>
+          <w:p>
+            <w:r>
+              <w:rPr>
+                <w:sz w:val="18"/>
+              </w:rPr>
+              <w:t>196.63</w:t>
+            </w:r>
+          </w:p>
+        </w:tc>
+        <w:tc>
+          <w:tcPr>
+            <w:tcW w:type="dxa" w:w="2304"/>
+            <w:vAlign w:val="center"/>
+            <w:tcMar>
+              <w:top w:w="80" w:type="dxa"/>
+              <w:start w:w="120" w:type="dxa"/>
+              <w:bottom w:w="80" w:type="dxa"/>
+              <w:end w:w="120" w:type="dxa"/>
+            </w:tcMar>
+          </w:tcPr>
+          <w:p>
+            <w:r>
+              <w:rPr>
+                <w:sz w:val="18"/>
+              </w:rPr>
+              <w:t>167.86</w:t>
+            </w:r>
+          </w:p>
+        </w:tc>
+        <w:tc>
+          <w:tcPr>
+            <w:tcW w:type="dxa" w:w="2304"/>
+            <w:vAlign w:val="center"/>
+            <w:tcMar>
+              <w:top w:w="80" w:type="dxa"/>
+              <w:start w:w="120" w:type="dxa"/>
+              <w:bottom w:w="80" w:type="dxa"/>
+              <w:end w:w="120" w:type="dxa"/>
+            </w:tcMar>
+          </w:tcPr>
+          <w:p>
+            <w:r>
+              <w:rPr>
+                <w:sz w:val="18"/>
+              </w:rPr>
+              <w:t>28.77</w:t>
+            </w:r>
+          </w:p>
+        </w:tc>
+      </w:tr>
+      <w:tr>
+        <w:tc>
+          <w:tcPr>
+            <w:tcW w:type="dxa" w:w="2448"/>
+            <w:vAlign w:val="center"/>
+            <w:tcMar>
+              <w:top w:w="80" w:type="dxa"/>
+              <w:start w:w="120" w:type="dxa"/>
+              <w:bottom w:w="80" w:type="dxa"/>
+              <w:end w:w="120" w:type="dxa"/>
+            </w:tcMar>
+          </w:tcPr>
+          <w:p>
+            <w:r>
+              <w:rPr>
+                <w:sz w:val="18"/>
+              </w:rPr>
+              <w:t>Kerosene</w:t>
+            </w:r>
+          </w:p>
+        </w:tc>
+        <w:tc>
+          <w:tcPr>
+            <w:tcW w:type="dxa" w:w="2304"/>
+            <w:vAlign w:val="center"/>
+            <w:tcMar>
+              <w:top w:w="80" w:type="dxa"/>
+              <w:start w:w="120" w:type="dxa"/>
+              <w:bottom w:w="80" w:type="dxa"/>
+              <w:end w:w="120" w:type="dxa"/>
+            </w:tcMar>
+          </w:tcPr>
+          <w:p>
+            <w:r>
+              <w:rPr>
+                <w:sz w:val="18"/>
+              </w:rPr>
+              <w:t>152.78</w:t>
+            </w:r>
+          </w:p>
+        </w:tc>
+        <w:tc>
+          <w:tcPr>
+            <w:tcW w:type="dxa" w:w="2304"/>
+            <w:vAlign w:val="center"/>
+            <w:tcMar>
+              <w:top w:w="80" w:type="dxa"/>
+              <w:start w:w="120" w:type="dxa"/>
+              <w:bottom w:w="80" w:type="dxa"/>
+              <w:end w:w="120" w:type="dxa"/>
+            </w:tcMar>
+          </w:tcPr>
+          <w:p>
+            <w:r>
+              <w:rPr>
+                <w:sz w:val="18"/>
+              </w:rPr>
+              <w:t>153.23</w:t>
+            </w:r>
+          </w:p>
+        </w:tc>
+        <w:tc>
+          <w:tcPr>
+            <w:tcW w:type="dxa" w:w="2304"/>
+            <w:vAlign w:val="center"/>
+            <w:tcMar>
+              <w:top w:w="80" w:type="dxa"/>
+              <w:start w:w="120" w:type="dxa"/>
+              <w:bottom w:w="80" w:type="dxa"/>
+              <w:end w:w="120" w:type="dxa"/>
+            </w:tcMar>
+          </w:tcPr>
+          <w:p>
+            <w:r>
+              <w:rPr>
+                <w:sz w:val="18"/>
+              </w:rPr>
+              <w:t>0.45</w:t>
             </w:r>
           </w:p>
         </w:tc>
@@ -3390,7 +3554,7 @@
               <w:rPr>
                 <w:sz w:val="18"/>
               </w:rPr>
-              <w:t>214.03</w:t>
+              <w:t>197.60</w:t>
             </w:r>
           </w:p>
         </w:tc>
@@ -3410,7 +3574,7 @@
               <w:rPr>
                 <w:sz w:val="18"/>
               </w:rPr>
-              <w:t>Unavailable</w:t>
+              <w:t>180.59</w:t>
             </w:r>
           </w:p>
         </w:tc>
@@ -3430,171 +3594,7 @@
               <w:rPr>
                 <w:sz w:val="18"/>
               </w:rPr>
-              <w:t>Unavailable</w:t>
-            </w:r>
-          </w:p>
-        </w:tc>
-      </w:tr>
-      <w:tr>
-        <w:tc>
-          <w:tcPr>
-            <w:tcW w:type="dxa" w:w="2448"/>
-            <w:vAlign w:val="center"/>
-            <w:tcMar>
-              <w:top w:w="80" w:type="dxa"/>
-              <w:start w:w="120" w:type="dxa"/>
-              <w:bottom w:w="80" w:type="dxa"/>
-              <w:end w:w="120" w:type="dxa"/>
-            </w:tcMar>
-          </w:tcPr>
-          <w:p>
-            <w:r>
-              <w:rPr>
-                <w:sz w:val="18"/>
-              </w:rPr>
-              <w:t>Diesel</w:t>
-            </w:r>
-          </w:p>
-        </w:tc>
-        <w:tc>
-          <w:tcPr>
-            <w:tcW w:type="dxa" w:w="2304"/>
-            <w:vAlign w:val="center"/>
-            <w:tcMar>
-              <w:top w:w="80" w:type="dxa"/>
-              <w:start w:w="120" w:type="dxa"/>
-              <w:bottom w:w="80" w:type="dxa"/>
-              <w:end w:w="120" w:type="dxa"/>
-            </w:tcMar>
-          </w:tcPr>
-          <w:p>
-            <w:r>
-              <w:rPr>
-                <w:sz w:val="18"/>
-              </w:rPr>
-              <w:t>222.86</w:t>
-            </w:r>
-          </w:p>
-        </w:tc>
-        <w:tc>
-          <w:tcPr>
-            <w:tcW w:type="dxa" w:w="2304"/>
-            <w:vAlign w:val="center"/>
-            <w:tcMar>
-              <w:top w:w="80" w:type="dxa"/>
-              <w:start w:w="120" w:type="dxa"/>
-              <w:bottom w:w="80" w:type="dxa"/>
-              <w:end w:w="120" w:type="dxa"/>
-            </w:tcMar>
-          </w:tcPr>
-          <w:p>
-            <w:r>
-              <w:rPr>
-                <w:sz w:val="18"/>
-              </w:rPr>
-              <w:t>Unavailable</w:t>
-            </w:r>
-          </w:p>
-        </w:tc>
-        <w:tc>
-          <w:tcPr>
-            <w:tcW w:type="dxa" w:w="2304"/>
-            <w:vAlign w:val="center"/>
-            <w:tcMar>
-              <w:top w:w="80" w:type="dxa"/>
-              <w:start w:w="120" w:type="dxa"/>
-              <w:bottom w:w="80" w:type="dxa"/>
-              <w:end w:w="120" w:type="dxa"/>
-            </w:tcMar>
-          </w:tcPr>
-          <w:p>
-            <w:r>
-              <w:rPr>
-                <w:sz w:val="18"/>
-              </w:rPr>
-              <w:t>Unavailable</w:t>
-            </w:r>
-          </w:p>
-        </w:tc>
-      </w:tr>
-      <w:tr>
-        <w:tc>
-          <w:tcPr>
-            <w:tcW w:type="dxa" w:w="2448"/>
-            <w:vAlign w:val="center"/>
-            <w:tcMar>
-              <w:top w:w="80" w:type="dxa"/>
-              <w:start w:w="120" w:type="dxa"/>
-              <w:bottom w:w="80" w:type="dxa"/>
-              <w:end w:w="120" w:type="dxa"/>
-            </w:tcMar>
-          </w:tcPr>
-          <w:p>
-            <w:r>
-              <w:rPr>
-                <w:sz w:val="18"/>
-              </w:rPr>
-              <w:t>Kerosene</w:t>
-            </w:r>
-          </w:p>
-        </w:tc>
-        <w:tc>
-          <w:tcPr>
-            <w:tcW w:type="dxa" w:w="2304"/>
-            <w:vAlign w:val="center"/>
-            <w:tcMar>
-              <w:top w:w="80" w:type="dxa"/>
-              <w:start w:w="120" w:type="dxa"/>
-              <w:bottom w:w="80" w:type="dxa"/>
-              <w:end w:w="120" w:type="dxa"/>
-            </w:tcMar>
-          </w:tcPr>
-          <w:p>
-            <w:r>
-              <w:rPr>
-                <w:sz w:val="18"/>
-              </w:rPr>
-              <w:t>191.38</w:t>
-            </w:r>
-          </w:p>
-        </w:tc>
-        <w:tc>
-          <w:tcPr>
-            <w:tcW w:type="dxa" w:w="2304"/>
-            <w:vAlign w:val="center"/>
-            <w:tcMar>
-              <w:top w:w="80" w:type="dxa"/>
-              <w:start w:w="120" w:type="dxa"/>
-              <w:bottom w:w="80" w:type="dxa"/>
-              <w:end w:w="120" w:type="dxa"/>
-            </w:tcMar>
-          </w:tcPr>
-          <w:p>
-            <w:r>
-              <w:rPr>
-                <w:sz w:val="18"/>
-              </w:rPr>
-              <w:t>Unavailable</w:t>
-            </w:r>
-          </w:p>
-        </w:tc>
-        <w:tc>
-          <w:tcPr>
-            <w:tcW w:type="dxa" w:w="2304"/>
-            <w:vAlign w:val="center"/>
-            <w:tcMar>
-              <w:top w:w="80" w:type="dxa"/>
-              <w:start w:w="120" w:type="dxa"/>
-              <w:bottom w:w="80" w:type="dxa"/>
-              <w:end w:w="120" w:type="dxa"/>
-            </w:tcMar>
-          </w:tcPr>
-          <w:p>
-            <w:r>
-              <w:rPr>
-                <w:sz w:val="18"/>
-              </w:rPr>
-              <w:t>Unavailable</w:t>
+              <w:t>17.01</w:t>
             </w:r>
           </w:p>
         </w:tc>
@@ -3605,7 +3605,7 @@
         <w:rPr>
           <w:i w:val="0"/>
         </w:rPr>
-        <w:t>Verified June 2026 component inputs are absent. July predictions, absolute errors, percentage errors, MAE, and RMSE are therefore not claimed. July official values are retained only as final evaluation values. Using July components would be target leakage; substituting March components would change the one-cycle-ahead horizon without evidence.</w:t>
+        <w:t>March 2026 is the latest complete verified component cycle. The model uses those inputs to predict the immediately following April 2026 prices. April is excluded from training and used only for chronological evaluation.</w:t>
       </w:r>
     </w:p>
     <w:p>
@@ -3650,7 +3650,7 @@
         <w:rPr>
           <w:i w:val="0"/>
         </w:rPr>
-        <w:t>The architecture is valid and explainable, but the available evidence is insufficient for a defensible July 2026 prediction. The high April holdout error and missing June inputs show why verified data and clear limitations are more important than manufacturing a successful forecast. The system's practical value also comes from price explanation, reconstruction, and transport budgeting.</w:t>
+        <w:t>The architecture is valid and explainable. The high April holdout error shows why verified data, chronological evaluation, and clear limitations are important. The system's practical value also comes from price explanation, reconstruction, and transport budgeting.</w:t>
       </w:r>
     </w:p>
     <w:p>
@@ -3666,14 +3666,6 @@
         <w:pStyle w:val="ListNumber"/>
       </w:pPr>
       <w:r>
-        <w:t>Obtain and verify the official June 2026 component annex before generating July predictions.</w:t>
-      </w:r>
-    </w:p>
-    <w:p>
-      <w:pPr>
-        <w:pStyle w:val="ListNumber"/>
-      </w:pPr>
-      <w:r>
         <w:t>Expand the component panel with continuous official cycles without interpolation.</w:t>
       </w:r>
     </w:p>
@@ -3682,7 +3674,7 @@
         <w:pStyle w:val="ListNumber"/>
       </w:pPr>
       <w:r>
-        <w:t>Retain chronological evaluation and keep July outside training.</w:t>
+        <w:t>Retain chronological evaluation with each target outside training.</w:t>
       </w:r>
     </w:p>
     <w:p>
@@ -6475,7 +6467,7 @@
         <w:pStyle w:val="ListNumber"/>
       </w:pPr>
       <w:r>
-        <w:t>Use Home for scope, users, persona, and official July evaluation values.</w:t>
+        <w:t>Use Home for scope, users, persona, and the live EPRA retail-price display.</w:t>
       </w:r>
     </w:p>
     <w:p>
@@ -6483,7 +6475,7 @@
         <w:pStyle w:val="ListNumber"/>
       </w:pPr>
       <w:r>
-        <w:t>Use July 2026 Prediction to inspect the input-availability decision.</w:t>
+        <w:t>Use Fuel Price Prediction to inspect the March-to-April estimate and error.</w:t>
       </w:r>
     </w:p>
     <w:p>
@@ -6587,7 +6579,7 @@
         <w:rPr>
           <w:i w:val="0"/>
         </w:rPr>
-        <w:t>The verified component cycles are August, October, November, and December 2024; February, June, July, and August 2025; and January, February, and March 2026. Other months, including June 2026, are not included as verified component records. No missing record has been interpolated.</w:t>
+        <w:t>The verified component cycles are August, October, November, and December 2024; February, June, July, and August 2025; and January, February, and March 2026. Other months are not included as verified component records. No missing record has been interpolated.</w:t>
       </w:r>
     </w:p>
     <w:sectPr>

</xml_diff>